<commit_message>
Aviso liquidez: link opcional a guía de inversión, solo para quien lo cargue
Nuevo campo de perfil "guia" (vacío por default para todos salvo Nico, que
ya viene precargado con finanzasconnico-web.vercel.app/guia.html). La
plantilla trae el párrafo nuevo envuelto en comentarios XML
<!--GUIA_START/END--> + una relación rId22 con target @@GUIA_URL@@; el
Suite lo sustituye cuando el asesor cargó un link, o borra el párrafo y la
relación enteros cuando lo dejó vacío, para no mandar a sus clientes a una
página que no es la de ellos.
Co-Authored-By: Claude Sonnet 5 <noreply@anthropic.com>
</commit_message>
<xml_diff>
--- a/plantillas-mail/plantilla-aviso.docx
+++ b/plantillas-mail/plantilla-aviso.docx
@@ -581,6 +581,52 @@
         </w:tc>
       </w:tr>
     </w:tbl>
+    <!--GUIA_START-->
+    <w:p>
+      <w:pPr>
+        <w:spacing w:before="200" w:after="200"/>
+      </w:pPr>
+      <w:r>
+        <w:rPr>
+          <w:rFonts w:ascii="Calibri" w:hAnsi="Calibri"/>
+          <w:b/>
+          <w:i w:val="0"/>
+          <w:sz w:val="22"/>
+        </w:rPr>
+        <w:t xml:space="preserve">¿Preferís entender antes de decidir? </w:t>
+      </w:r>
+      <w:r>
+        <w:rPr>
+          <w:rFonts w:ascii="Calibri" w:hAnsi="Calibri"/>
+          <w:b w:val="0"/>
+          <w:i w:val="0"/>
+          <w:color w:val="6C7572"/>
+          <w:sz w:val="22"/>
+        </w:rPr>
+        <w:t xml:space="preserve">Tenemos una guía con explicaciones simples y tutoriales paso a paso: </w:t>
+      </w:r>
+      <w:hyperlink r:id="rId22">
+        <w:r>
+          <w:rPr>
+            <w:b/>
+            <w:color w:val="106CB5"/>
+            <w:u w:val="single"/>
+          </w:rPr>
+          <w:t xml:space="preserve">Centro de aprendizaje</w:t>
+        </w:r>
+      </w:hyperlink>
+      <w:r>
+        <w:rPr>
+          <w:rFonts w:ascii="Calibri" w:hAnsi="Calibri"/>
+          <w:b w:val="0"/>
+          <w:i w:val="0"/>
+          <w:color w:val="6C7572"/>
+          <w:sz w:val="22"/>
+        </w:rPr>
+        <w:t>.</w:t>
+      </w:r>
+    </w:p>
+    <!--GUIA_END-->
     <w:p>
       <w:pPr>
         <w:spacing w:before="240"/>

</xml_diff>